<commit_message>
PSF: auto-uzupelnianie checkboxow z danych (wyksztalcenie/status/plec/DEGURBA) + stale domyslne oceny
</commit_message>
<xml_diff>
--- a/public/wzory/PSF_B_Indywidualny_Plan_Rozwoju_szablon.docx
+++ b/public/wzory/PSF_B_Indywidualny_Plan_Rozwoju_szablon.docx
@@ -237,6 +237,7 @@
                 <w:i/>
                 <w:color w:val="808080"/>
               </w:rPr>
+              <w:t>……………</w:t>
             </w:r>
           </w:p>
         </w:tc>
@@ -355,6 +356,7 @@
                 <w:i/>
                 <w:color w:val="808080"/>
               </w:rPr>
+              <w:t>2/5</w:t>
             </w:r>
           </w:p>
         </w:tc>
@@ -384,6 +386,7 @@
                 <w:i/>
                 <w:color w:val="808080"/>
               </w:rPr>
+              <w:t>3/5</w:t>
             </w:r>
           </w:p>
         </w:tc>
@@ -413,6 +416,7 @@
                 <w:i/>
                 <w:color w:val="808080"/>
               </w:rPr>
+              <w:t>3/5</w:t>
             </w:r>
           </w:p>
         </w:tc>
@@ -442,6 +446,7 @@
                 <w:i/>
                 <w:color w:val="808080"/>
               </w:rPr>
+              <w:t>3/5</w:t>
             </w:r>
           </w:p>
         </w:tc>
@@ -471,6 +476,7 @@
                 <w:i/>
                 <w:color w:val="808080"/>
               </w:rPr>
+              <w:t>2/5</w:t>
             </w:r>
           </w:p>
         </w:tc>
@@ -507,7 +513,33 @@
         <w:spacing w:after="60"/>
       </w:pPr>
       <w:r>
-        <w:t xml:space="preserve"> ……………………………</w:t>
+        <w:rPr>
+          <w:rFonts w:ascii="Arial" w:eastAsia="Arial" w:hAnsi="Arial" w:cs="Arial"/>
+        </w:rPr>
+        <w:t>Potrzeba rozwoju w obszarze kompetencji cyfrowych, zielonych oraz kompetencji wspierających aktywność edukacyjną osoby dorosłej.</w:t>
+      </w:r>
+      <w:r>
+        <w:rPr>
+          <w:rFonts w:ascii="Arial" w:eastAsia="Arial" w:hAnsi="Arial" w:cs="Arial"/>
+          <w:i/>
+          <w:color w:val="808080"/>
+        </w:rPr>
+      </w:r>
+      <w:proofErr w:type="spellStart"/>
+      <w:r>
+        <w:rPr>
+          <w:rFonts w:ascii="Arial" w:eastAsia="Arial" w:hAnsi="Arial" w:cs="Arial"/>
+          <w:i/>
+          <w:color w:val="808080"/>
+        </w:rPr>
+      </w:r>
+      <w:proofErr w:type="spellEnd"/>
+      <w:r>
+        <w:rPr>
+          <w:rFonts w:ascii="Arial" w:eastAsia="Arial" w:hAnsi="Arial" w:cs="Arial"/>
+          <w:i/>
+          <w:color w:val="808080"/>
+        </w:rPr>
       </w:r>
     </w:p>
     <w:p>
@@ -623,7 +655,7 @@
         <w:rPr>
           <w:rFonts w:ascii="Arial" w:eastAsia="Arial" w:hAnsi="Arial" w:cs="Arial"/>
         </w:rPr>
-        <w:t xml:space="preserve">Typ usługi: </w:t>
+        <w:t>Typ usługi: szkolenie / kurs zgodny z BUR</w:t>
       </w:r>
       <w:r>
         <w:rPr>
@@ -631,7 +663,6 @@
           <w:i/>
           <w:color w:val="808080"/>
         </w:rPr>
-        <w:t>……………………………</w:t>
       </w:r>
     </w:p>
     <w:p>
@@ -642,7 +673,7 @@
         <w:rPr>
           <w:rFonts w:ascii="Arial" w:eastAsia="Arial" w:hAnsi="Arial" w:cs="Arial"/>
         </w:rPr>
-        <w:t xml:space="preserve">Kategoria BUR: </w:t>
+        <w:t>Kategoria BUR: ……………………</w:t>
       </w:r>
       <w:r>
         <w:rPr>
@@ -650,7 +681,6 @@
           <w:i/>
           <w:color w:val="808080"/>
         </w:rPr>
-        <w:t>……………………………</w:t>
       </w:r>
     </w:p>
     <w:p>
@@ -661,7 +691,7 @@
         <w:rPr>
           <w:rFonts w:ascii="Arial" w:eastAsia="Arial" w:hAnsi="Arial" w:cs="Arial"/>
         </w:rPr>
-        <w:t xml:space="preserve">Forma realizacji: </w:t>
+        <w:t>Forma realizacji: do wyboru uczestnika (stacjonarna / zdalna / mieszana)</w:t>
       </w:r>
       <w:r>
         <w:rPr>
@@ -669,7 +699,6 @@
           <w:i/>
           <w:color w:val="808080"/>
         </w:rPr>
-        <w:t>……………………………</w:t>
       </w:r>
     </w:p>
     <w:p>
@@ -688,7 +717,7 @@
           <w:i/>
           <w:color w:val="808080"/>
         </w:rPr>
-        <w:t>……………………………</w:t>
+        <w:t>……………</w:t>
       </w:r>
     </w:p>
     <w:p>
@@ -796,6 +825,7 @@
                 <w:i/>
                 <w:color w:val="808080"/>
               </w:rPr>
+              <w:t>……………</w:t>
             </w:r>
           </w:p>
         </w:tc>
@@ -853,6 +883,7 @@
                 <w:i/>
                 <w:color w:val="808080"/>
               </w:rPr>
+              <w:t>……………</w:t>
             </w:r>
           </w:p>
         </w:tc>

</xml_diff>

<commit_message>
Napraw formularze uczestnika projektu PSF
</commit_message>
<xml_diff>
--- a/public/wzory/PSF_B_Indywidualny_Plan_Rozwoju_szablon.docx
+++ b/public/wzory/PSF_B_Indywidualny_Plan_Rozwoju_szablon.docx
@@ -374,7 +374,7 @@
                 <w:i/>
                 <w:color w:val="808080"/>
               </w:rPr>
-              <w:t xml:space="preserve">1</w:t>
+              <w:t>{{psf_poziom_cyfrowe}}</w:t>
             </w:r>
           </w:p>
         </w:tc>
@@ -408,7 +408,7 @@
                 <w:i/>
                 <w:color w:val="808080"/>
               </w:rPr>
-              <w:t xml:space="preserve">2</w:t>
+              <w:t>{{psf_poziom_jezykowe}}</w:t>
             </w:r>
           </w:p>
         </w:tc>
@@ -442,7 +442,7 @@
                 <w:i/>
                 <w:color w:val="808080"/>
               </w:rPr>
-              <w:t xml:space="preserve">3</w:t>
+              <w:t>{{psf_poziom_spoleczne}}</w:t>
             </w:r>
           </w:p>
         </w:tc>
@@ -476,7 +476,7 @@
                 <w:i/>
                 <w:color w:val="808080"/>
               </w:rPr>
-              <w:t xml:space="preserve">3</w:t>
+              <w:t>{{psf_poziom_zawodowe}}</w:t>
             </w:r>
           </w:p>
         </w:tc>
@@ -510,7 +510,7 @@
                 <w:i/>
                 <w:color w:val="808080"/>
               </w:rPr>
-              <w:t xml:space="preserve">3</w:t>
+              <w:t>{{psf_poziom_zielone}}</w:t>
             </w:r>
           </w:p>
         </w:tc>

</xml_diff>